<commit_message>
v26: fix systematic citation renumber miss - multi-number citations were left at old numbers
</commit_message>
<xml_diff>
--- a/papers/20_MRP-ST-Repair_Patterns/Manuscript_Patterns.docx
+++ b/papers/20_MRP-ST-Repair_Patterns/Manuscript_Patterns.docx
@@ -281,17 +281,17 @@
         <w:t>identity leakage</w:t>
       </w:r>
       <w:r>
-        <w:t>. It is distinct from the classical train/test contamination studied in data mining,[1] because nothing is duplicated across the split: the leakage lives in a latent variable (group membership) that a random split silently preserves, and it is distinct from domain shift,[3,4] because the training and deployment distributions need not differ for the failure to occur.</w:t>
+        <w:t>. It is distinct from the classical train/test contamination studied in data mining,[1] because nothing is duplicated across the split: the leakage lives in a latent variable (group membership) that a random split silently preserves, and it is distinct from domain shift,[2,3] because the training and deployment distributions need not differ for the failure to occur.</w:t>
       </w:r>
     </w:p>
     <w:p>
       <w:r>
-        <w:t>The consequences are well documented across fields and are mostly reported as reproducibility failures rather than as a single named mechanism,[22] which is part of why the problem is usually patched case by case rather than measured. Leakage of correlated or duplicated records invalidates published performance estimates;[1] shortcut solutions let models pass benchmarks while failing on the intended task;[4] chest-radiograph models trained across hospitals degrade on unseen sites and partly encode site and patient identity;[6,7] leave-one-subject-out evaluation, rather than record-level cross-validation, is the correct protocol for wearable and clinical time-series data, and using the wrong one inflates accuracy systematically.[7] Ecological and remote-sensing modelling reached the same conclusion from the opposite direction: blocked cross-validation, in which whole spatial, temporal, hierarchical or phylogenetic blocks are held out rather than individual records, is nearly universally more appropriate than random cross-validation wherever a dependence structure exists,[39] and re-validating a large-scale forest-biomass map with spatially disjoint blocks collapsed an apparent predictive R2 above 0.5 to quasi-null predictive power.[40] A cross-field survey finds leakage affecting 294 papers across 17 fields and supplies a taxonomy of eight leakage types together with model info sheets for preventing them.[22]</w:t>
+        <w:t>The consequences are well documented across fields and are mostly reported as reproducibility failures rather than as a single named mechanism,[22] which is part of why the problem is usually patched case by case rather than measured. Leakage of correlated or duplicated records invalidates published performance estimates;[1] shortcut solutions let models pass benchmarks while failing on the intended task;[4] chest-radiograph models trained across hospitals degrade on unseen sites and partly encode site and patient identity;[5,6] leave-one-subject-out evaluation, rather than record-level cross-validation, is the correct protocol for wearable and clinical time-series data, and using the wrong one inflates accuracy systematically.[7] Ecological and remote-sensing modelling reached the same conclusion from the opposite direction: blocked cross-validation, in which whole spatial, temporal, hierarchical or phylogenetic blocks are held out rather than individual records, is nearly universally more appropriate than random cross-validation wherever a dependence structure exists,[39] and re-validating a large-scale forest-biomass map with spatially disjoint blocks collapsed an apparent predictive R2 above 0.5 to quasi-null predictive power.[40] A cross-field survey finds leakage affecting 294 papers across 17 fields and supplies a taxonomy of eight leakage types together with model info sheets for preventing them.[22]</w:t>
       </w:r>
     </w:p>
     <w:p>
       <w:r>
-        <w:t>What these reports share is a structural precondition (multiple observations per group, observation-level splitting) and an evaluation that cannot tell whether a model learned the target property or the group. Group leakage is not unrecognised. It is one of the eight leakage types in the cross-field taxonomy of ref [22], which documents it across 294 papers in 17 fields, and the remedies that literature offers are the right ones for the situation it addresses: construct the split so that no group straddles it,[8,40,41] and disclose what you did.[22] The size of the effect has been measured too, field by field: on brain MRI, splitting a volume at slice level rather than subject level raised reported accuracy by 30, 29, 48 and 55 percentage points on four datasets, and a randomly relabelled dataset still returned about 96% accuracy under the slice-level split against about 50% under the subject-level one.[41] Both are design-time remedies, and both are instructions for someone who has not trained yet.</w:t>
+        <w:t>What these reports share is a structural precondition (multiple observations per group, observation-level splitting) and an evaluation that cannot tell whether a model learned the target property or the group. Group leakage is not unrecognised. It is one of the eight leakage types in the cross-field taxonomy of ref [22], which documents it across 294 papers in 17 fields, and the remedies that literature offers are the right ones for the situation it addresses: construct the split so that no group straddles it,[7,39,40] and disclose what you did.[22] The size of the effect has been measured too, field by field: on brain MRI, splitting a volume at slice level rather than subject level raised reported accuracy by 30, 29, 48 and 55 percentage points on four datasets, and a randomly relabelled dataset still returned about 96% accuracy under the slice-level split against about 50% under the subject-level one.[41] Both are design-time remedies, and both are instructions for someone who has not trained yet.</w:t>
       </w:r>
     </w:p>
     <w:p>
@@ -311,7 +311,7 @@
     </w:p>
     <w:p>
       <w:r>
-        <w:t>Adversarial removal of an attribute from a learned representation is a mature idea, and we place ourselves inside that literature rather than beside it. Censoring representations with an adversary,[26] controllable invariance through adversarial feature learning,[27] adversarially fair and transferable representations,[28] and the domain-adversarial machinery we build on[3,4] all attach a predictor to a representation and train the encoder to make that predictor fail. Our repair operator is deliberately an instance of this standard design: a group-identity classifier attached through a gradient-reversal layer. We claim no novelty for it, and we say so here because the alternative reading, that this paper proposes a new debiasing method, would misdescribe the contribution. The reason is that this literature has also established, repeatedly, that a defeated adversary is not evidence of removal: attributes that an adversary drove to chance during training remain recoverable by a post-hoc classifier trained on the same representation,[29] and the same gap has been reported for explicit bias removal in image embeddings[30] and for iterative nullspace projection.[31] What is missing is therefore not another operator but an instrument: something that asks, after any removal attempt, whether what remains still transfers across groups and whether it exceeds what permutation alone would produce. Our contributions sit at exactly that point, and they are properties of the audit rather than of the adversary. The consequence appears inside our own results below: on the simulated identity-confounding control the planted fingerprint was cleared only partially, and in the two cross-domain cohorts group identity remained five to eight times more recoverable than chance after repair. We read both as the gap of ref [29] reproduced by our own operator, which is precisely why the acceptance decision is delegated to an instrument rather than to the adversary's loss.</w:t>
+        <w:t>Adversarial removal of an attribute from a learned representation is a mature idea, and we place ourselves inside that literature rather than beside it. Censoring representations with an adversary,[26] controllable invariance through adversarial feature learning,[27] adversarially fair and transferable representations,[28] and the domain-adversarial machinery we build on[2,3] all attach a predictor to a representation and train the encoder to make that predictor fail. Our repair operator is deliberately an instance of this standard design: a group-identity classifier attached through a gradient-reversal layer. We claim no novelty for it, and we say so here because the alternative reading, that this paper proposes a new debiasing method, would misdescribe the contribution. The reason is that this literature has also established, repeatedly, that a defeated adversary is not evidence of removal: attributes that an adversary drove to chance during training remain recoverable by a post-hoc classifier trained on the same representation,[29] and the same gap has been reported for explicit bias removal in image embeddings[30] and for iterative nullspace projection.[31] What is missing is therefore not another operator but an instrument: something that asks, after any removal attempt, whether what remains still transfers across groups and whether it exceeds what permutation alone would produce. Our contributions sit at exactly that point, and they are properties of the audit rather than of the adversary. The consequence appears inside our own results below: on the simulated identity-confounding control the planted fingerprint was cleared only partially, and in the two cross-domain cohorts group identity remained five to eight times more recoverable than chance after repair. We read both as the gap of ref [29] reproduced by our own operator, which is precisely why the acceptance decision is delegated to an instrument rather than to the adversary's loss.</w:t>
       </w:r>
     </w:p>
     <w:p>
@@ -325,7 +325,7 @@
         <w:t>within</w:t>
       </w:r>
       <w:r>
-        <w:t xml:space="preserve"> groups; the adversarial members of that family (iMAP,[32] SCIDRL,[33] DAVAE[34]) use the same gradient-reversal machinery as our operator but optimise cross-batch mixing and are scored by integration metrics such as batch entropy and the adjusted Rand index, not by a calibrated group-level label-dependence statistic. Domain-adversarial training[3,4] is the closest machinery to ours, but it is used to transfer across domains, not to remove a group identity that is confounded with the label inside a single training set. Group-disjoint splitting[7] is a preventive practice, not a remediation of an already-trained model. In fairness research, adversarial and constrained objectives learn representations independent of a sensitive attribute,[27–29,36,37] and the fairness–accuracy trade-offs they navigate are the same shape as the one our feasibility condition makes explicit; the surveys of that literature[21,38] document the trade-off, whereas our contribution is the pre-computable diagnosis of when it has no feasible point.</w:t>
+        <w:t xml:space="preserve"> groups; the adversarial members of that family (iMAP,[32] SCIDRL,[33] DAVAE[34]) use the same gradient-reversal machinery as our operator but optimise cross-batch mixing and are scored by integration metrics such as batch entropy and the adjusted Rand index, not by a calibrated group-level label-dependence statistic. Domain-adversarial training[2,3] is the closest machinery to ours, but it is used to transfer across domains, not to remove a group identity that is confounded with the label inside a single training set. Group-disjoint splitting[7] is a preventive practice, not a remediation of an already-trained model. In fairness research, adversarial and constrained objectives learn representations independent of a sensitive attribute,[26–28,35,36] and the fairness–accuracy trade-offs they navigate are the same shape as the one our feasibility condition makes explicit; the surveys of that literature[20,37] document the trade-off, whereas our contribution is the pre-computable diagnosis of when it has no feasible point.</w:t>
       </w:r>
     </w:p>
     <w:p>
@@ -418,7 +418,7 @@
         <w:t>An auditable instrument: a calibrated statistic with measured operating characteristics and an acceptance protocol.</w:t>
       </w:r>
       <w:r>
-        <w:t xml:space="preserve"> The label-dependence index grades a model under leave-one-group-out against its own refit permutation null, and the instrument is itself tested on controls with known ground truth: across 75 positive-control runs the shared, group-transferable program survived every dose, while the detector remained non-blind on 45 identity-confounding runs (36 of them dosed; no false alarms). The operator being graded is deliberately standard (a group-identity classifier trained jointly with the encoder through a gradient-reversal layer[3,4]) and we claim no novelty for it. The operating characteristics above are what make any verdict below interpretable, and they are reported for the instrument rather than for the operator. A practical corollary, established head-to-head below: in-sample criteria cannot certify acceptance, because methods that are indistinguishable on the in-sample memorization gap differ in kind on the group-level statistic.</w:t>
+        <w:t xml:space="preserve"> The label-dependence index grades a model under leave-one-group-out against its own refit permutation null, and the instrument is itself tested on controls with known ground truth: across 75 positive-control runs the shared, group-transferable program survived every dose, while the detector remained non-blind on 45 identity-confounding runs (36 of them dosed; no false alarms). The operator being graded is deliberately standard (a group-identity classifier trained jointly with the encoder through a gradient-reversal layer[2,3]) and we claim no novelty for it. The operating characteristics above are what make any verdict below interpretable, and they are reported for the instrument rather than for the operator. A practical corollary, established head-to-head below: in-sample criteria cannot certify acceptance, because methods that are indistinguishable on the in-sample memorization gap differ in kind on the group-level statistic.</w:t>
       </w:r>
     </w:p>
     <w:p>
@@ -542,7 +542,7 @@
         <w:t>Where the novelty lies, stated plainly.</w:t>
       </w:r>
       <w:r>
-        <w:t xml:space="preserve"> Finding 1 is the claim we would want to survive if everything else here were withdrawn: it is a statement about evaluation rather than about any method, it errs in one direction only (a unit-level split flatters a model rather than penalising it), and adopting the fix requires nothing new. What is new about it is not the direction of the error, which the blocked-cross-validation literature established,[40,41] but its calibrated magnitude: a number, expressed in null-scale units, that says how much of a reported result the shortcut accounts for, is comparable across cohorts and domains, and stays interpretable after an intervention has been applied. Finding 2 is the instrument that makes findings 3 to 7 readable; the operator inside it is a standard adversarial head, chosen deliberately, because a familiar operator makes the verdict easier to audit and easier to distrust. Findings 3 to 8 are diagnostics and one intervention: they say when repair is worth attempting, when it is provably not, and how far the predictions travel, and they are the parts a better operator or a larger cohort would revise first. A reader who takes the operator away keeps the trap, the instrument and the boundaries; a reader who takes the instrument away still keeps the rule about the split, which costs nothing and applies everywhere.</w:t>
+        <w:t xml:space="preserve"> Finding 1 is the claim we would want to survive if everything else here were withdrawn: it is a statement about evaluation rather than about any method, it errs in one direction only (a unit-level split flatters a model rather than penalising it), and adopting the fix requires nothing new. What is new about it is not the direction of the error, which the blocked-cross-validation literature established,[39,40] but its calibrated magnitude: a number, expressed in null-scale units, that says how much of a reported result the shortcut accounts for, is comparable across cohorts and domains, and stays interpretable after an intervention has been applied. Finding 2 is the instrument that makes findings 3 to 7 readable; the operator inside it is a standard adversarial head, chosen deliberately, because a familiar operator makes the verdict easier to audit and easier to distrust. Findings 3 to 8 are diagnostics and one intervention: they say when repair is worth attempting, when it is provably not, and how far the predictions travel, and they are the parts a better operator or a larger cohort would revise first. A reader who takes the operator away keeps the trap, the instrument and the boundaries; a reader who takes the instrument away still keeps the rule about the split, which costs nothing and applies everywhere.</w:t>
       </w:r>
     </w:p>
     <w:p>
@@ -685,7 +685,7 @@
         <w:t>Repair operator.</w:t>
       </w:r>
       <w:r>
-        <w:t xml:space="preserve"> We train a graph-attention encoder[13] on the unit-level spatial graph (k-nearest-neighbour, k = 6, with a large coordinate offset that prevents cross-slide edges) with a linear decoder reconstructing expression, and attach a group-identity classifier through a gradient-reversal layer[3,4] with ramped reversal strength α = min(1, 2·epoch/T) (a stability-hardened variant ramps only after a 50-epoch adversary warm-up, with α = 0 before it). The adversary maximizes group-identity accuracy; the encoder, through the reversal, minimizes it. A single hyperparameter λ scales the adversarial term: λ = 0 recovers the un-repaired baseline, and increasing λ doses the repair. In our validation domain the grouping variable is the donor, the units are tissue spots, and the released software instantiation is MRP-ST-Repair.</w:t>
+        <w:t xml:space="preserve"> We train a graph-attention encoder[13] on the unit-level spatial graph (k-nearest-neighbour, k = 6, with a large coordinate offset that prevents cross-slide edges) with a linear decoder reconstructing expression, and attach a group-identity classifier through a gradient-reversal layer[2,3] with ramped reversal strength α = min(1, 2·epoch/T) (a stability-hardened variant ramps only after a 50-epoch adversary warm-up, with α = 0 before it). The adversary maximizes group-identity accuracy; the encoder, through the reversal, minimizes it. A single hyperparameter λ scales the adversarial term: λ = 0 recovers the un-repaired baseline, and increasing λ doses the repair. In our validation domain the grouping variable is the donor, the units are tissue spots, and the released software instantiation is MRP-ST-Repair.</w:t>
       </w:r>
     </w:p>
     <w:p>
@@ -1010,7 +1010,7 @@
         <w:t>is</w:t>
       </w:r>
       <w:r>
-        <w:t xml:space="preserve"> that method: a gradient-reversal layer,[3,4] a cross-entropy adversary on the grouping variable and a scalar dose λ is the canonical design,[27–29] so a second instance of it would compare our acceptance protocol against itself. What can be compared are methods that pursue the same goal through a different objective, reweighting (Group-DRO) and invariance (IRM). The gap this leaves is real and is stated in the limitations: non-adversarial removal families were not benchmarked, and the operating characteristics of finding 1 would need re-measuring for any of them. Two things about that gap should be kept straight. The instrument does not depend on the operator: LDI, the three axes and the group-level acceptance rule read a representation rather than a training objective, so the same protocol can be run on the output of any deconfounding method, including the ones not benchmarked here. And the two failure modes we report are properties of two specific methods, not a law about all of them: whether null-space projection, contrastive objectives or conditional reweighting fail in the same way is unknown.</w:t>
+        <w:t xml:space="preserve"> that method: a gradient-reversal layer,[2,3] a cross-entropy adversary on the grouping variable and a scalar dose λ is the canonical design,[26–28] so a second instance of it would compare our acceptance protocol against itself. What can be compared are methods that pursue the same goal through a different objective, reweighting (Group-DRO) and invariance (IRM). The gap this leaves is real and is stated in the limitations: non-adversarial removal families were not benchmarked, and the operating characteristics of finding 1 would need re-measuring for any of them. Two things about that gap should be kept straight. The instrument does not depend on the operator: LDI, the three axes and the group-level acceptance rule read a representation rather than a training objective, so the same protocol can be run on the output of any deconfounding method, including the ones not benchmarked here. And the two failure modes we report are properties of two specific methods, not a law about all of them: whether null-space projection, contrastive objectives or conditional reweighting fail in the same way is unknown.</w:t>
       </w:r>
     </w:p>
     <w:p>
@@ -3315,7 +3315,7 @@
         <w:t>Evaluation hygiene is a separate, transferable result.</w:t>
       </w:r>
       <w:r>
-        <w:t xml:space="preserve"> The sibling-unit effect (unit-level cross-validation pinned at ceiling while group-level holdout collapses) is not caused by our repair: the repair merely exposes it with a knob. It is a warning about any group-structured dataset in which groups contribute multiple units, and the remedy (accept at the group level) costs nothing. The same logic applies to the endpoint result: because all three real cohorts have one section per donor, repair had no leakage channel to remove and paid a pure fidelity cost. That repair did not improve endpoints is a statement about where the method applies, and it is a statement the framework yields in advance. This is the same failure the blocked-cross-validation literature documents,[40,41] and we make no claim of priority for the phenomenon: that literature established the prescription (hold out whole blocks rather than records) and demonstrated the optimism case by case. What we add is the measurement, and a measurement is needed even where the prescription is followed. A group-disjoint split stops the shortcut from entering the training objective, but it cannot tell the owner of an already-trained representation how much of its reported performance is group-driven, and it cannot certify an intervention that claims to have removed the shortcut, because by then the split is fixed and the counterfactual has to be measured rather than designed. The check itself is one line in an existing evaluation script, given a recorded grouping variable.</w:t>
+        <w:t xml:space="preserve"> The sibling-unit effect (unit-level cross-validation pinned at ceiling while group-level holdout collapses) is not caused by our repair: the repair merely exposes it with a knob. It is a warning about any group-structured dataset in which groups contribute multiple units, and the remedy (accept at the group level) costs nothing. The same logic applies to the endpoint result: because all three real cohorts have one section per donor, repair had no leakage channel to remove and paid a pure fidelity cost. That repair did not improve endpoints is a statement about where the method applies, and it is a statement the framework yields in advance. This is the same failure the blocked-cross-validation literature documents,[39,40] and we make no claim of priority for the phenomenon: that literature established the prescription (hold out whole blocks rather than records) and demonstrated the optimism case by case. What we add is the measurement, and a measurement is needed even where the prescription is followed. A group-disjoint split stops the shortcut from entering the training objective, but it cannot tell the owner of an already-trained representation how much of its reported performance is group-driven, and it cannot certify an intervention that claims to have removed the shortcut, because by then the split is fixed and the counterfactual has to be measured rather than designed. The check itself is one line in an existing evaluation script, given a recorded grouping variable.</w:t>
       </w:r>
     </w:p>
     <w:p>
@@ -4600,7 +4600,7 @@
         <w:t>One repair family.</w:t>
       </w:r>
       <w:r>
-        <w:t xml:space="preserve"> Every repair in this paper is adversarial, trained through a gradient-reversal layer.[3,4] We did not develop or benchmark alternative repair paradigms, each of which is plausible and might trade fidelity against leakage differently: contrastive objectives with cross-group positive pairs; group-conditioned reweighting or importance sampling; explicit orthogonality or variance penalties on the group subspace; iterative nullspace projection;[31] disentangled or factorised latent-variable models; and generative removal. The three most informative next comparisons are the post-hoc or partly post-hoc ones, because they are cheap to run on the same grid: iterative nullspace projection,[31] contrastive cross-group objectives, and orthogonality penalties on the group subspace. The consequences differ by result. Proposition 1 and Remark 1 concern the </w:t>
+        <w:t xml:space="preserve"> Every repair in this paper is adversarial, trained through a gradient-reversal layer.[2,3] We did not develop or benchmark alternative repair paradigms, each of which is plausible and might trade fidelity against leakage differently: contrastive objectives with cross-group positive pairs; group-conditioned reweighting or importance sampling; explicit orthogonality or variance penalties on the group subspace; iterative nullspace projection;[31] disentangled or factorised latent-variable models; and generative removal. The three most informative next comparisons are the post-hoc or partly post-hoc ones, because they are cheap to run on the same grid: iterative nullspace projection,[31] contrastive cross-group objectives, and orthogonality penalties on the group subspace. The consequences differ by result. Proposition 1 and Remark 1 concern the </w:t>
       </w:r>
       <w:r>
         <w:rPr>
@@ -5536,7 +5536,7 @@
               <w:rPr>
                 <w:sz w:val="18"/>
               </w:rPr>
-              <w:t>HAR [24,26]</w:t>
+              <w:t>HAR [23,25]</w:t>
             </w:r>
           </w:p>
         </w:tc>
@@ -5606,7 +5606,7 @@
               <w:rPr>
                 <w:sz w:val="18"/>
               </w:rPr>
-              <w:t>Gas Sensor Array Drift [25,26]</w:t>
+              <w:t>Gas Sensor Array Drift [24,25]</w:t>
             </w:r>
           </w:p>
         </w:tc>

</xml_diff>

<commit_message>
v28 DOI: fill Zenodo 10.5281/zenodo.23640979 and correct the dead repo URL
- Code. (Resource availability), Key Resources Table software row, DATA AND CODE
  AVAILABILITY, and the cover letter now carry the resolved Zenodo link
  https://doi.org/10.5281/zenodo.23640979
- removed the 'deposited in a DOI-minting archive before acceptance' and
  'pending verification' phrasings (same class as TO BE INSERTED)
- fixed a duplicated sentence in the data availability paragraph
- corrected the repository URL: cervix-st-multimodal is still 404, the published
  and Zenodo-archived repo is WorldBMW/pathway-anchored-risk-benchmark (tag v1.0.0)
- new scripts/_fill_doi_v28.py patches the docx in place (5 embedded figures kept);
  scripts/_fill_dois.py relies on placeholders that no longer exist -- do not use
- QA (_qa_v28.py): ALL CHECKS PASSED
</commit_message>
<xml_diff>
--- a/papers/20_MRP-ST-Repair_Patterns/Manuscript_Patterns.docx
+++ b/papers/20_MRP-ST-Repair_Patterns/Manuscript_Patterns.docx
@@ -5902,7 +5902,7 @@
         <w:rPr>
           <w:b/>
         </w:rPr>
-        <w:t>Code. The analysis scripts, manifests, seeds and figure generators are released under the tagged state v1.0.0 at https://github.com/WorldBMW/cervix-st-multimodal and are deposited in Zenodo, a DOI-minting archive, before acceptance; the DOI is reported in the version of record. Every number in this paper is reproducible from the released manifests, and the public cohorts are re-downloaded by the scripts rather than redistributed.</w:t>
+        <w:t>Code. The analysis scripts, manifests, seeds and figure generators are released under the tagged state v1.0.0 at https://github.com/WorldBMW/pathway-anchored-risk-benchmark and are archived in Zenodo at https://doi.org/10.5281/zenodo.23640979. Every number in this paper is reproducible from the released manifests, and the public cohorts are re-downloaded by the scripts rather than redistributed.</w:t>
       </w:r>
       <w:r/>
     </w:p>
@@ -6721,12 +6721,12 @@
               <w:rPr>
                 <w:sz w:val="16"/>
               </w:rPr>
-            </w:r>
-            <w:r>
-              <w:rPr>
-                <w:sz w:val="16"/>
-              </w:rPr>
-              <w:t>https://github.com/WorldBMW/cervix-st-multimodal (intended tag v1.0.0); public access and Zenodo archiving pending verification</w:t>
+              <w:t>https://github.com/WorldBMW/pathway-anchored-risk-benchmark (tag v1.0.0); Zenodo archive https://doi.org/10.5281/zenodo.23640979</w:t>
+            </w:r>
+            <w:r>
+              <w:rPr>
+                <w:sz w:val="16"/>
+              </w:rPr>
             </w:r>
           </w:p>
         </w:tc>
@@ -12042,7 +12042,7 @@
     </w:p>
     <w:p>
       <w:r>
-        <w:t>The public source accessions used for the transcriptomic analyses are GSE208654, GSE217237, GSE268014, GSE278936 and GSE316098, together with the stated 10x Genomics example. HAR and Gas Sensor Array Drift are obtained from the UCI repository. All analysis code, manifests, seeds and figure generators are released under a tagged version and are deposited in Zenodo, a DOI-minting archive, before acceptance; the DOI is reported in the version of record, and the frozen state matching this manuscript is release v1.0.0 at https://github.com/WorldBMW/cervix-st-multimodal. Public datasets are re-downloaded by the released scripts rather than redistributed. Raw participant data are not newly collected by this study, and source licences and access restrictions apply to each accession as deposited.</w:t>
+        <w:t>The public source accessions used for the transcriptomic analyses are GSE208654, GSE217237, GSE268014, GSE278936 and GSE316098, together with the stated 10x Genomics example. HAR and Gas Sensor Array Drift are obtained from the UCI repository. All analysis code, manifests, seeds and figure generators are released under the tagged version v1.0.0 at https://github.com/WorldBMW/pathway-anchored-risk-benchmark and are archived in Zenodo at https://doi.org/10.5281/zenodo.23640979; the frozen state matching this manuscript is release v1.0.0. Public datasets are re-downloaded by the released scripts rather than redistributed. Raw participant data are not newly collected by this study, and source licences and access restrictions apply to each accession as deposited.</w:t>
       </w:r>
     </w:p>
     <w:p>

</xml_diff>

<commit_message>
withdraw the mismatched Zenodo DOI and point at the new repository
The DOI 10.5281/zenodo.23640979 archives WorldBMW/pathway-anchored-risk-benchmark,
which contains no script from this manuscript (0 hits for exp_crossdomain_audit,
refit_grid_audit, exp_regate_v28, make_figures_patterns) and is the code base of
the earlier CMPB submission. Citing it would make 'every number is reproducible
from the released manifests' false, so the DOI and the old repository URL are
removed from the manuscript, the key resources table, the availability section
and the cover letter; all four now name github.com/WorldBMW/mrp-st-audit.

scripts/_add_zenodo_doi.py re-inserts a DOI at the three manuscript sites and the
cover-letter site once it exists, then delegates docx syncing to _fill_doi_v28.py.
QA (_qa_v28.py) still passes; the manuscript docx keeps its five embedded figures.
</commit_message>
<xml_diff>
--- a/papers/20_MRP-ST-Repair_Patterns/Manuscript_Patterns.docx
+++ b/papers/20_MRP-ST-Repair_Patterns/Manuscript_Patterns.docx
@@ -5902,7 +5902,7 @@
         <w:rPr>
           <w:b/>
         </w:rPr>
-        <w:t>Code. The analysis scripts, manifests, seeds and figure generators are released under the tagged state v1.0.0 at https://github.com/WorldBMW/pathway-anchored-risk-benchmark and are archived in Zenodo at https://doi.org/10.5281/zenodo.23640979. Every number in this paper is reproducible from the released manifests, and the public cohorts are re-downloaded by the scripts rather than redistributed.</w:t>
+        <w:t>Code. The analysis scripts, manifests, seeds and figure generators are released under the tagged state v1.0.0 at https://github.com/WorldBMW/mrp-st-audit. Every number in this paper is reproducible from the released manifests, and the public cohorts are re-downloaded by the scripts rather than redistributed.</w:t>
       </w:r>
       <w:r/>
     </w:p>
@@ -6721,7 +6721,7 @@
               <w:rPr>
                 <w:sz w:val="16"/>
               </w:rPr>
-              <w:t>https://github.com/WorldBMW/pathway-anchored-risk-benchmark (tag v1.0.0); Zenodo archive https://doi.org/10.5281/zenodo.23640979</w:t>
+              <w:t>https://github.com/WorldBMW/mrp-st-audit (tag v1.0.0)</w:t>
             </w:r>
             <w:r>
               <w:rPr>
@@ -12042,7 +12042,7 @@
     </w:p>
     <w:p>
       <w:r>
-        <w:t>The public source accessions used for the transcriptomic analyses are GSE208654, GSE217237, GSE268014, GSE278936 and GSE316098, together with the stated 10x Genomics example. HAR and Gas Sensor Array Drift are obtained from the UCI repository. All analysis code, manifests, seeds and figure generators are released under the tagged version v1.0.0 at https://github.com/WorldBMW/pathway-anchored-risk-benchmark and are archived in Zenodo at https://doi.org/10.5281/zenodo.23640979; the frozen state matching this manuscript is release v1.0.0. Public datasets are re-downloaded by the released scripts rather than redistributed. Raw participant data are not newly collected by this study, and source licences and access restrictions apply to each accession as deposited.</w:t>
+        <w:t>The public source accessions used for the transcriptomic analyses are GSE208654, GSE217237, GSE268014, GSE278936 and GSE316098, together with the stated 10x Genomics example. HAR and Gas Sensor Array Drift are obtained from the UCI repository. All analysis code, manifests, seeds and figure generators are released under the tagged version v1.0.0 at https://github.com/WorldBMW/mrp-st-audit; the frozen state matching this manuscript is release v1.0.0. Public datasets are re-downloaded by the released scripts rather than redistributed. Raw participant data are not newly collected by this study, and source licences and access restrictions apply to each accession as deposited.</w:t>
       </w:r>
     </w:p>
     <w:p>

</xml_diff>